<commit_message>
uifis: rework lecture 10 and practice 9
Expand the network services lecture and rewrite practice 9 around a deployable HTTP service with systemd, firewall, port forwarding and failure recovery. Replace the repeated conveyor figure with a service probe tester, move its controls below the figure, and regenerate reports and the site.
</commit_message>
<xml_diff>
--- a/courses/4/uifis/dist/reports/UIFIS_practice-9_report-template.docx
+++ b/courses/4/uifis/dist/reports/UIFIS_practice-9_report-template.docx
@@ -4,119 +4,1178 @@
   <w:body>
     <w:p>
       <w:pPr>
-        <w:pStyle w:val="Title"/>
+        <w:jc w:val="center"/>
       </w:pPr>
       <w:r>
-        <w:t>Отчёт по практике 9. Развёртывание базовой сетевой службы</w:t>
+        <w:rPr>
+          <w:b/>
+          <w:sz w:val="28"/>
+        </w:rPr>
+        <w:t>Устройство и функционирование информационной системы (МДК.06.03)</w:t>
+      </w:r>
+    </w:p>
+    <w:p>
+      <w:pPr>
+        <w:jc w:val="center"/>
+      </w:pPr>
+      <w:r>
+        <w:rPr>
+          <w:b/>
+          <w:sz w:val="26"/>
+        </w:rPr>
+        <w:t>Отчёт по практической работе 9</w:t>
+      </w:r>
+    </w:p>
+    <w:p>
+      <w:pPr>
+        <w:jc w:val="center"/>
+      </w:pPr>
+      <w:r>
+        <w:rPr>
+          <w:b w:val="0"/>
+          <w:sz w:val="24"/>
+        </w:rPr>
+        <w:t>Тема: Развёртывание базовой сетевой службы</w:t>
+      </w:r>
+    </w:p>
+    <w:p/>
+    <w:p>
+      <w:r>
+        <w:rPr>
+          <w:b w:val="0"/>
+          <w:sz w:val="24"/>
+        </w:rPr>
+        <w:t>ФИО студента: ______________________________________</w:t>
       </w:r>
     </w:p>
     <w:p>
       <w:r>
         <w:rPr>
+          <w:b w:val="0"/>
+          <w:sz w:val="24"/>
+        </w:rPr>
+        <w:t>Группа: ______________________  Дата: _______________</w:t>
+      </w:r>
+    </w:p>
+    <w:p/>
+    <w:p>
+      <w:r>
+        <w:rPr>
           <w:b/>
+          <w:sz w:val="24"/>
         </w:rPr>
-        <w:t xml:space="preserve">ФИО: </w:t>
-      </w:r>
-      <w:r>
-        <w:t>_____________________________________________</w:t>
+        <w:t>Цель работы</w:t>
       </w:r>
     </w:p>
     <w:p>
       <w:r>
         <w:rPr>
-          <w:b/>
+          <w:b w:val="0"/>
+          <w:sz w:val="24"/>
         </w:rPr>
-        <w:t xml:space="preserve">Группа: </w:t>
-      </w:r>
-      <w:r>
-        <w:t>_____________________________________________</w:t>
+        <w:t>Развернуть учебную HTTP-службу uifis-web в Ubuntu Server, оформить запуск через systemd, настроить отдельного пользователя, firewall и проброс порта, а затем проверить отказ и восстановление службы.</w:t>
       </w:r>
     </w:p>
+    <w:p/>
     <w:p>
       <w:r>
         <w:rPr>
           <w:b/>
+          <w:sz w:val="24"/>
         </w:rPr>
-        <w:t xml:space="preserve">Дата: </w:t>
-      </w:r>
-      <w:r>
-        <w:t>_____________________________________________</w:t>
+        <w:t>Схема стенда</w:t>
       </w:r>
     </w:p>
+    <w:tbl>
+      <w:tblPr>
+        <w:tblStyle w:val="TableGrid"/>
+        <w:tblW w:type="auto" w:w="0"/>
+        <w:tblLook w:firstColumn="1" w:firstRow="1" w:lastColumn="0" w:lastRow="0" w:noHBand="0" w:noVBand="1" w:val="04A0"/>
+      </w:tblPr>
+      <w:tblGrid>
+        <w:gridCol w:w="4320"/>
+        <w:gridCol w:w="4320"/>
+      </w:tblGrid>
+      <w:tr>
+        <w:tc>
+          <w:tcPr>
+            <w:tcW w:type="dxa" w:w="4320"/>
+          </w:tcPr>
+          <w:p>
+            <w:r>
+              <w:rPr>
+                <w:sz w:val="18"/>
+              </w:rPr>
+              <w:t>Элемент</w:t>
+            </w:r>
+          </w:p>
+        </w:tc>
+        <w:tc>
+          <w:tcPr>
+            <w:tcW w:type="dxa" w:w="4320"/>
+          </w:tcPr>
+          <w:p>
+            <w:r>
+              <w:rPr>
+                <w:sz w:val="18"/>
+              </w:rPr>
+              <w:t>Значение</w:t>
+            </w:r>
+          </w:p>
+        </w:tc>
+      </w:tr>
+      <w:tr>
+        <w:tc>
+          <w:tcPr>
+            <w:tcW w:type="dxa" w:w="4320"/>
+          </w:tcPr>
+          <w:p>
+            <w:r>
+              <w:rPr>
+                <w:sz w:val="18"/>
+              </w:rPr>
+              <w:t>Рабочий компьютер</w:t>
+            </w:r>
+          </w:p>
+        </w:tc>
+        <w:tc>
+          <w:tcPr>
+            <w:tcW w:type="dxa" w:w="4320"/>
+          </w:tcPr>
+          <w:p>
+            <w:r>
+              <w:rPr>
+                <w:sz w:val="18"/>
+              </w:rPr>
+              <w:t>Windows, PowerShell, curl.exe</w:t>
+            </w:r>
+          </w:p>
+        </w:tc>
+      </w:tr>
+      <w:tr>
+        <w:tc>
+          <w:tcPr>
+            <w:tcW w:type="dxa" w:w="4320"/>
+          </w:tcPr>
+          <w:p>
+            <w:r>
+              <w:rPr>
+                <w:sz w:val="18"/>
+              </w:rPr>
+              <w:t>Виртуальная машина</w:t>
+            </w:r>
+          </w:p>
+        </w:tc>
+        <w:tc>
+          <w:tcPr>
+            <w:tcW w:type="dxa" w:w="4320"/>
+          </w:tcPr>
+          <w:p>
+            <w:r>
+              <w:rPr>
+                <w:sz w:val="18"/>
+              </w:rPr>
+              <w:t>uifis-srv01, Ubuntu Server</w:t>
+            </w:r>
+          </w:p>
+        </w:tc>
+      </w:tr>
+      <w:tr>
+        <w:tc>
+          <w:tcPr>
+            <w:tcW w:type="dxa" w:w="4320"/>
+          </w:tcPr>
+          <w:p>
+            <w:r>
+              <w:rPr>
+                <w:sz w:val="18"/>
+              </w:rPr>
+              <w:t>Сеть VirtualBox</w:t>
+            </w:r>
+          </w:p>
+        </w:tc>
+        <w:tc>
+          <w:tcPr>
+            <w:tcW w:type="dxa" w:w="4320"/>
+          </w:tcPr>
+          <w:p>
+            <w:r>
+              <w:rPr>
+                <w:sz w:val="18"/>
+              </w:rPr>
+              <w:t>NAT, адрес гостя 10.0.2.15</w:t>
+            </w:r>
+          </w:p>
+        </w:tc>
+      </w:tr>
+      <w:tr>
+        <w:tc>
+          <w:tcPr>
+            <w:tcW w:type="dxa" w:w="4320"/>
+          </w:tcPr>
+          <w:p>
+            <w:r>
+              <w:rPr>
+                <w:sz w:val="18"/>
+              </w:rPr>
+              <w:t>SSH</w:t>
+            </w:r>
+          </w:p>
+        </w:tc>
+        <w:tc>
+          <w:tcPr>
+            <w:tcW w:type="dxa" w:w="4320"/>
+          </w:tcPr>
+          <w:p>
+            <w:r>
+              <w:rPr>
+                <w:sz w:val="18"/>
+              </w:rPr>
+              <w:t>хост 127.0.0.1:2222 → гость 22/tcp</w:t>
+            </w:r>
+          </w:p>
+        </w:tc>
+      </w:tr>
+      <w:tr>
+        <w:tc>
+          <w:tcPr>
+            <w:tcW w:type="dxa" w:w="4320"/>
+          </w:tcPr>
+          <w:p>
+            <w:r>
+              <w:rPr>
+                <w:sz w:val="18"/>
+              </w:rPr>
+              <w:t>Служба</w:t>
+            </w:r>
+          </w:p>
+        </w:tc>
+        <w:tc>
+          <w:tcPr>
+            <w:tcW w:type="dxa" w:w="4320"/>
+          </w:tcPr>
+          <w:p>
+            <w:r>
+              <w:rPr>
+                <w:sz w:val="18"/>
+              </w:rPr>
+              <w:t>uifis-web, HTTP, 0.0.0.0:8080</w:t>
+            </w:r>
+          </w:p>
+        </w:tc>
+      </w:tr>
+      <w:tr>
+        <w:tc>
+          <w:tcPr>
+            <w:tcW w:type="dxa" w:w="4320"/>
+          </w:tcPr>
+          <w:p>
+            <w:r>
+              <w:rPr>
+                <w:sz w:val="18"/>
+              </w:rPr>
+              <w:t>Проброс порта</w:t>
+            </w:r>
+          </w:p>
+        </w:tc>
+        <w:tc>
+          <w:tcPr>
+            <w:tcW w:type="dxa" w:w="4320"/>
+          </w:tcPr>
+          <w:p>
+            <w:r>
+              <w:rPr>
+                <w:sz w:val="18"/>
+              </w:rPr>
+              <w:t>хост 127.0.0.1:8080 → гость 8080/tcp</w:t>
+            </w:r>
+          </w:p>
+        </w:tc>
+      </w:tr>
+      <w:tr>
+        <w:tc>
+          <w:tcPr>
+            <w:tcW w:type="dxa" w:w="4320"/>
+          </w:tcPr>
+          <w:p>
+            <w:r>
+              <w:rPr>
+                <w:sz w:val="18"/>
+              </w:rPr>
+              <w:t>Пользователь службы</w:t>
+            </w:r>
+          </w:p>
+        </w:tc>
+        <w:tc>
+          <w:tcPr>
+            <w:tcW w:type="dxa" w:w="4320"/>
+          </w:tcPr>
+          <w:p>
+            <w:r>
+              <w:rPr>
+                <w:sz w:val="18"/>
+              </w:rPr>
+              <w:t>uifis, без интерактивного входа</w:t>
+            </w:r>
+          </w:p>
+        </w:tc>
+      </w:tr>
+      <w:tr>
+        <w:tc>
+          <w:tcPr>
+            <w:tcW w:type="dxa" w:w="4320"/>
+          </w:tcPr>
+          <w:p>
+            <w:r>
+              <w:rPr>
+                <w:sz w:val="18"/>
+              </w:rPr>
+              <w:t>Каталог службы</w:t>
+            </w:r>
+          </w:p>
+        </w:tc>
+        <w:tc>
+          <w:tcPr>
+            <w:tcW w:type="dxa" w:w="4320"/>
+          </w:tcPr>
+          <w:p>
+            <w:r>
+              <w:rPr>
+                <w:sz w:val="18"/>
+              </w:rPr>
+              <w:t>/srv/uifis-web</w:t>
+            </w:r>
+          </w:p>
+        </w:tc>
+      </w:tr>
+    </w:tbl>
+    <w:p/>
+    <w:p>
+      <w:pPr>
+        <w:jc w:val="center"/>
+      </w:pPr>
+      <w:r>
+        <w:rPr>
+          <w:i/>
+          <w:sz w:val="22"/>
+        </w:rPr>
+        <w:t>[ Вставьте схему стенда: хост, VirtualBox NAT, проброс порта, служба ]</w:t>
+      </w:r>
+    </w:p>
+    <w:p/>
     <w:p>
       <w:r>
         <w:rPr>
           <w:b/>
+          <w:sz w:val="24"/>
         </w:rPr>
-        <w:t xml:space="preserve">Вариант: </w:t>
-      </w:r>
-      <w:r>
-        <w:t>_____________________________________________</w:t>
+        <w:t>Контракт службы</w:t>
       </w:r>
     </w:p>
+    <w:tbl>
+      <w:tblPr>
+        <w:tblStyle w:val="TableGrid"/>
+        <w:tblW w:type="auto" w:w="0"/>
+        <w:tblLook w:firstColumn="1" w:firstRow="1" w:lastColumn="0" w:lastRow="0" w:noHBand="0" w:noVBand="1" w:val="04A0"/>
+      </w:tblPr>
+      <w:tblGrid>
+        <w:gridCol w:w="1440"/>
+        <w:gridCol w:w="1440"/>
+        <w:gridCol w:w="1440"/>
+        <w:gridCol w:w="1440"/>
+        <w:gridCol w:w="1440"/>
+        <w:gridCol w:w="1440"/>
+      </w:tblGrid>
+      <w:tr>
+        <w:tc>
+          <w:tcPr>
+            <w:tcW w:type="dxa" w:w="1440"/>
+          </w:tcPr>
+          <w:p>
+            <w:r>
+              <w:rPr>
+                <w:sz w:val="16"/>
+              </w:rPr>
+              <w:t>Метод</w:t>
+            </w:r>
+          </w:p>
+        </w:tc>
+        <w:tc>
+          <w:tcPr>
+            <w:tcW w:type="dxa" w:w="1440"/>
+          </w:tcPr>
+          <w:p>
+            <w:r>
+              <w:rPr>
+                <w:sz w:val="16"/>
+              </w:rPr>
+              <w:t>Путь</w:t>
+            </w:r>
+          </w:p>
+        </w:tc>
+        <w:tc>
+          <w:tcPr>
+            <w:tcW w:type="dxa" w:w="1440"/>
+          </w:tcPr>
+          <w:p>
+            <w:r>
+              <w:rPr>
+                <w:sz w:val="16"/>
+              </w:rPr>
+              <w:t>Код</w:t>
+            </w:r>
+          </w:p>
+        </w:tc>
+        <w:tc>
+          <w:tcPr>
+            <w:tcW w:type="dxa" w:w="1440"/>
+          </w:tcPr>
+          <w:p>
+            <w:r>
+              <w:rPr>
+                <w:sz w:val="16"/>
+              </w:rPr>
+              <w:t>Тип ответа</w:t>
+            </w:r>
+          </w:p>
+        </w:tc>
+        <w:tc>
+          <w:tcPr>
+            <w:tcW w:type="dxa" w:w="1440"/>
+          </w:tcPr>
+          <w:p>
+            <w:r>
+              <w:rPr>
+                <w:sz w:val="16"/>
+              </w:rPr>
+              <w:t>Назначение</w:t>
+            </w:r>
+          </w:p>
+        </w:tc>
+        <w:tc>
+          <w:tcPr>
+            <w:tcW w:type="dxa" w:w="1440"/>
+          </w:tcPr>
+          <w:p>
+            <w:r>
+              <w:rPr>
+                <w:sz w:val="16"/>
+              </w:rPr>
+              <w:t>Факт</w:t>
+            </w:r>
+          </w:p>
+        </w:tc>
+      </w:tr>
+      <w:tr>
+        <w:tc>
+          <w:tcPr>
+            <w:tcW w:type="dxa" w:w="1440"/>
+          </w:tcPr>
+          <w:p>
+            <w:r>
+              <w:rPr>
+                <w:sz w:val="16"/>
+              </w:rPr>
+              <w:t>GET</w:t>
+            </w:r>
+          </w:p>
+        </w:tc>
+        <w:tc>
+          <w:tcPr>
+            <w:tcW w:type="dxa" w:w="1440"/>
+          </w:tcPr>
+          <w:p>
+            <w:r>
+              <w:rPr>
+                <w:sz w:val="16"/>
+              </w:rPr>
+              <w:t>/</w:t>
+            </w:r>
+          </w:p>
+        </w:tc>
+        <w:tc>
+          <w:tcPr>
+            <w:tcW w:type="dxa" w:w="1440"/>
+          </w:tcPr>
+          <w:p>
+            <w:r>
+              <w:rPr>
+                <w:sz w:val="16"/>
+              </w:rPr>
+              <w:t>200</w:t>
+            </w:r>
+          </w:p>
+        </w:tc>
+        <w:tc>
+          <w:tcPr>
+            <w:tcW w:type="dxa" w:w="1440"/>
+          </w:tcPr>
+          <w:p>
+            <w:r>
+              <w:rPr>
+                <w:sz w:val="16"/>
+              </w:rPr>
+              <w:t>text/html</w:t>
+            </w:r>
+          </w:p>
+        </w:tc>
+        <w:tc>
+          <w:tcPr>
+            <w:tcW w:type="dxa" w:w="1440"/>
+          </w:tcPr>
+          <w:p>
+            <w:r>
+              <w:rPr>
+                <w:sz w:val="16"/>
+              </w:rPr>
+              <w:t>Главная страница службы</w:t>
+            </w:r>
+          </w:p>
+        </w:tc>
+        <w:tc>
+          <w:tcPr>
+            <w:tcW w:type="dxa" w:w="1440"/>
+          </w:tcPr>
+          <w:p>
+            <w:r>
+              <w:rPr>
+                <w:sz w:val="16"/>
+              </w:rPr>
+            </w:r>
+          </w:p>
+        </w:tc>
+      </w:tr>
+      <w:tr>
+        <w:tc>
+          <w:tcPr>
+            <w:tcW w:type="dxa" w:w="1440"/>
+          </w:tcPr>
+          <w:p>
+            <w:r>
+              <w:rPr>
+                <w:sz w:val="16"/>
+              </w:rPr>
+              <w:t>GET</w:t>
+            </w:r>
+          </w:p>
+        </w:tc>
+        <w:tc>
+          <w:tcPr>
+            <w:tcW w:type="dxa" w:w="1440"/>
+          </w:tcPr>
+          <w:p>
+            <w:r>
+              <w:rPr>
+                <w:sz w:val="16"/>
+              </w:rPr>
+              <w:t>/health.json</w:t>
+            </w:r>
+          </w:p>
+        </w:tc>
+        <w:tc>
+          <w:tcPr>
+            <w:tcW w:type="dxa" w:w="1440"/>
+          </w:tcPr>
+          <w:p>
+            <w:r>
+              <w:rPr>
+                <w:sz w:val="16"/>
+              </w:rPr>
+              <w:t>200</w:t>
+            </w:r>
+          </w:p>
+        </w:tc>
+        <w:tc>
+          <w:tcPr>
+            <w:tcW w:type="dxa" w:w="1440"/>
+          </w:tcPr>
+          <w:p>
+            <w:r>
+              <w:rPr>
+                <w:sz w:val="16"/>
+              </w:rPr>
+              <w:t>application/json</w:t>
+            </w:r>
+          </w:p>
+        </w:tc>
+        <w:tc>
+          <w:tcPr>
+            <w:tcW w:type="dxa" w:w="1440"/>
+          </w:tcPr>
+          <w:p>
+            <w:r>
+              <w:rPr>
+                <w:sz w:val="16"/>
+              </w:rPr>
+              <w:t>Состояние и время работы</w:t>
+            </w:r>
+          </w:p>
+        </w:tc>
+        <w:tc>
+          <w:tcPr>
+            <w:tcW w:type="dxa" w:w="1440"/>
+          </w:tcPr>
+          <w:p>
+            <w:r>
+              <w:rPr>
+                <w:sz w:val="16"/>
+              </w:rPr>
+            </w:r>
+          </w:p>
+        </w:tc>
+      </w:tr>
+      <w:tr>
+        <w:tc>
+          <w:tcPr>
+            <w:tcW w:type="dxa" w:w="1440"/>
+          </w:tcPr>
+          <w:p>
+            <w:r>
+              <w:rPr>
+                <w:sz w:val="16"/>
+              </w:rPr>
+              <w:t>GET</w:t>
+            </w:r>
+          </w:p>
+        </w:tc>
+        <w:tc>
+          <w:tcPr>
+            <w:tcW w:type="dxa" w:w="1440"/>
+          </w:tcPr>
+          <w:p>
+            <w:r>
+              <w:rPr>
+                <w:sz w:val="16"/>
+              </w:rPr>
+              <w:t>/api/services</w:t>
+            </w:r>
+          </w:p>
+        </w:tc>
+        <w:tc>
+          <w:tcPr>
+            <w:tcW w:type="dxa" w:w="1440"/>
+          </w:tcPr>
+          <w:p>
+            <w:r>
+              <w:rPr>
+                <w:sz w:val="16"/>
+              </w:rPr>
+              <w:t>200</w:t>
+            </w:r>
+          </w:p>
+        </w:tc>
+        <w:tc>
+          <w:tcPr>
+            <w:tcW w:type="dxa" w:w="1440"/>
+          </w:tcPr>
+          <w:p>
+            <w:r>
+              <w:rPr>
+                <w:sz w:val="16"/>
+              </w:rPr>
+              <w:t>application/json</w:t>
+            </w:r>
+          </w:p>
+        </w:tc>
+        <w:tc>
+          <w:tcPr>
+            <w:tcW w:type="dxa" w:w="1440"/>
+          </w:tcPr>
+          <w:p>
+            <w:r>
+              <w:rPr>
+                <w:sz w:val="16"/>
+              </w:rPr>
+              <w:t>Каталог сетевых служб</w:t>
+            </w:r>
+          </w:p>
+        </w:tc>
+        <w:tc>
+          <w:tcPr>
+            <w:tcW w:type="dxa" w:w="1440"/>
+          </w:tcPr>
+          <w:p>
+            <w:r>
+              <w:rPr>
+                <w:sz w:val="16"/>
+              </w:rPr>
+            </w:r>
+          </w:p>
+        </w:tc>
+      </w:tr>
+      <w:tr>
+        <w:tc>
+          <w:tcPr>
+            <w:tcW w:type="dxa" w:w="1440"/>
+          </w:tcPr>
+          <w:p>
+            <w:r>
+              <w:rPr>
+                <w:sz w:val="16"/>
+              </w:rPr>
+              <w:t>GET</w:t>
+            </w:r>
+          </w:p>
+        </w:tc>
+        <w:tc>
+          <w:tcPr>
+            <w:tcW w:type="dxa" w:w="1440"/>
+          </w:tcPr>
+          <w:p>
+            <w:r>
+              <w:rPr>
+                <w:sz w:val="16"/>
+              </w:rPr>
+              <w:t>/missing</w:t>
+            </w:r>
+          </w:p>
+        </w:tc>
+        <w:tc>
+          <w:tcPr>
+            <w:tcW w:type="dxa" w:w="1440"/>
+          </w:tcPr>
+          <w:p>
+            <w:r>
+              <w:rPr>
+                <w:sz w:val="16"/>
+              </w:rPr>
+              <w:t>404</w:t>
+            </w:r>
+          </w:p>
+        </w:tc>
+        <w:tc>
+          <w:tcPr>
+            <w:tcW w:type="dxa" w:w="1440"/>
+          </w:tcPr>
+          <w:p>
+            <w:r>
+              <w:rPr>
+                <w:sz w:val="16"/>
+              </w:rPr>
+              <w:t>application/json</w:t>
+            </w:r>
+          </w:p>
+        </w:tc>
+        <w:tc>
+          <w:tcPr>
+            <w:tcW w:type="dxa" w:w="1440"/>
+          </w:tcPr>
+          <w:p>
+            <w:r>
+              <w:rPr>
+                <w:sz w:val="16"/>
+              </w:rPr>
+              <w:t>Ошибка для неизвестного пути</w:t>
+            </w:r>
+          </w:p>
+        </w:tc>
+        <w:tc>
+          <w:tcPr>
+            <w:tcW w:type="dxa" w:w="1440"/>
+          </w:tcPr>
+          <w:p>
+            <w:r>
+              <w:rPr>
+                <w:sz w:val="16"/>
+              </w:rPr>
+            </w:r>
+          </w:p>
+        </w:tc>
+      </w:tr>
+      <w:tr>
+        <w:tc>
+          <w:tcPr>
+            <w:tcW w:type="dxa" w:w="1440"/>
+          </w:tcPr>
+          <w:p>
+            <w:r>
+              <w:rPr>
+                <w:sz w:val="16"/>
+              </w:rPr>
+              <w:t>HEAD</w:t>
+            </w:r>
+          </w:p>
+        </w:tc>
+        <w:tc>
+          <w:tcPr>
+            <w:tcW w:type="dxa" w:w="1440"/>
+          </w:tcPr>
+          <w:p>
+            <w:r>
+              <w:rPr>
+                <w:sz w:val="16"/>
+              </w:rPr>
+              <w:t>/health.json</w:t>
+            </w:r>
+          </w:p>
+        </w:tc>
+        <w:tc>
+          <w:tcPr>
+            <w:tcW w:type="dxa" w:w="1440"/>
+          </w:tcPr>
+          <w:p>
+            <w:r>
+              <w:rPr>
+                <w:sz w:val="16"/>
+              </w:rPr>
+              <w:t>200</w:t>
+            </w:r>
+          </w:p>
+        </w:tc>
+        <w:tc>
+          <w:tcPr>
+            <w:tcW w:type="dxa" w:w="1440"/>
+          </w:tcPr>
+          <w:p>
+            <w:r>
+              <w:rPr>
+                <w:sz w:val="16"/>
+              </w:rPr>
+              <w:t>без тела</w:t>
+            </w:r>
+          </w:p>
+        </w:tc>
+        <w:tc>
+          <w:tcPr>
+            <w:tcW w:type="dxa" w:w="1440"/>
+          </w:tcPr>
+          <w:p>
+            <w:r>
+              <w:rPr>
+                <w:sz w:val="16"/>
+              </w:rPr>
+              <w:t>Проверка заголовков</w:t>
+            </w:r>
+          </w:p>
+        </w:tc>
+        <w:tc>
+          <w:tcPr>
+            <w:tcW w:type="dxa" w:w="1440"/>
+          </w:tcPr>
+          <w:p>
+            <w:r>
+              <w:rPr>
+                <w:sz w:val="16"/>
+              </w:rPr>
+            </w:r>
+          </w:p>
+        </w:tc>
+      </w:tr>
+    </w:tbl>
+    <w:p/>
     <w:p>
-      <w:pPr>
-        <w:pStyle w:val="Heading1"/>
-      </w:pPr>
       <w:r>
-        <w:t>1. Стенд</w:t>
+        <w:rPr>
+          <w:b/>
+          <w:sz w:val="24"/>
+        </w:rPr>
+        <w:t>Параметры развёртывания</w:t>
       </w:r>
     </w:p>
+    <w:tbl>
+      <w:tblPr>
+        <w:tblStyle w:val="TableGrid"/>
+        <w:tblW w:type="auto" w:w="0"/>
+        <w:tblLook w:firstColumn="1" w:firstRow="1" w:lastColumn="0" w:lastRow="0" w:noHBand="0" w:noVBand="1" w:val="04A0"/>
+      </w:tblPr>
+      <w:tblGrid>
+        <w:gridCol w:w="2880"/>
+        <w:gridCol w:w="2880"/>
+        <w:gridCol w:w="2880"/>
+      </w:tblGrid>
+      <w:tr>
+        <w:tc>
+          <w:tcPr>
+            <w:tcW w:type="dxa" w:w="2880"/>
+          </w:tcPr>
+          <w:p>
+            <w:r>
+              <w:rPr>
+                <w:sz w:val="18"/>
+              </w:rPr>
+              <w:t>Параметр</w:t>
+            </w:r>
+          </w:p>
+        </w:tc>
+        <w:tc>
+          <w:tcPr>
+            <w:tcW w:type="dxa" w:w="2880"/>
+          </w:tcPr>
+          <w:p>
+            <w:r>
+              <w:rPr>
+                <w:sz w:val="18"/>
+              </w:rPr>
+              <w:t>Значение</w:t>
+            </w:r>
+          </w:p>
+        </w:tc>
+        <w:tc>
+          <w:tcPr>
+            <w:tcW w:type="dxa" w:w="2880"/>
+          </w:tcPr>
+          <w:p>
+            <w:r>
+              <w:rPr>
+                <w:sz w:val="18"/>
+              </w:rPr>
+              <w:t>Факт</w:t>
+            </w:r>
+          </w:p>
+        </w:tc>
+      </w:tr>
+      <w:tr>
+        <w:tc>
+          <w:tcPr>
+            <w:tcW w:type="dxa" w:w="2880"/>
+          </w:tcPr>
+          <w:p>
+            <w:r>
+              <w:rPr>
+                <w:sz w:val="18"/>
+              </w:rPr>
+              <w:t>Имя службы</w:t>
+            </w:r>
+          </w:p>
+        </w:tc>
+        <w:tc>
+          <w:tcPr>
+            <w:tcW w:type="dxa" w:w="2880"/>
+          </w:tcPr>
+          <w:p/>
+        </w:tc>
+        <w:tc>
+          <w:tcPr>
+            <w:tcW w:type="dxa" w:w="2880"/>
+          </w:tcPr>
+          <w:p/>
+        </w:tc>
+      </w:tr>
+      <w:tr>
+        <w:tc>
+          <w:tcPr>
+            <w:tcW w:type="dxa" w:w="2880"/>
+          </w:tcPr>
+          <w:p>
+            <w:r>
+              <w:rPr>
+                <w:sz w:val="18"/>
+              </w:rPr>
+              <w:t>Пользователь</w:t>
+            </w:r>
+          </w:p>
+        </w:tc>
+        <w:tc>
+          <w:tcPr>
+            <w:tcW w:type="dxa" w:w="2880"/>
+          </w:tcPr>
+          <w:p/>
+        </w:tc>
+        <w:tc>
+          <w:tcPr>
+            <w:tcW w:type="dxa" w:w="2880"/>
+          </w:tcPr>
+          <w:p/>
+        </w:tc>
+      </w:tr>
+      <w:tr>
+        <w:tc>
+          <w:tcPr>
+            <w:tcW w:type="dxa" w:w="2880"/>
+          </w:tcPr>
+          <w:p>
+            <w:r>
+              <w:rPr>
+                <w:sz w:val="18"/>
+              </w:rPr>
+              <w:t>Рабочая директория</w:t>
+            </w:r>
+          </w:p>
+        </w:tc>
+        <w:tc>
+          <w:tcPr>
+            <w:tcW w:type="dxa" w:w="2880"/>
+          </w:tcPr>
+          <w:p/>
+        </w:tc>
+        <w:tc>
+          <w:tcPr>
+            <w:tcW w:type="dxa" w:w="2880"/>
+          </w:tcPr>
+          <w:p/>
+        </w:tc>
+      </w:tr>
+      <w:tr>
+        <w:tc>
+          <w:tcPr>
+            <w:tcW w:type="dxa" w:w="2880"/>
+          </w:tcPr>
+          <w:p>
+            <w:r>
+              <w:rPr>
+                <w:sz w:val="18"/>
+              </w:rPr>
+              <w:t>Файл приложения</w:t>
+            </w:r>
+          </w:p>
+        </w:tc>
+        <w:tc>
+          <w:tcPr>
+            <w:tcW w:type="dxa" w:w="2880"/>
+          </w:tcPr>
+          <w:p/>
+        </w:tc>
+        <w:tc>
+          <w:tcPr>
+            <w:tcW w:type="dxa" w:w="2880"/>
+          </w:tcPr>
+          <w:p/>
+        </w:tc>
+      </w:tr>
+      <w:tr>
+        <w:tc>
+          <w:tcPr>
+            <w:tcW w:type="dxa" w:w="2880"/>
+          </w:tcPr>
+          <w:p>
+            <w:r>
+              <w:rPr>
+                <w:sz w:val="18"/>
+              </w:rPr>
+              <w:t>Адрес прослушивания</w:t>
+            </w:r>
+          </w:p>
+        </w:tc>
+        <w:tc>
+          <w:tcPr>
+            <w:tcW w:type="dxa" w:w="2880"/>
+          </w:tcPr>
+          <w:p/>
+        </w:tc>
+        <w:tc>
+          <w:tcPr>
+            <w:tcW w:type="dxa" w:w="2880"/>
+          </w:tcPr>
+          <w:p/>
+        </w:tc>
+      </w:tr>
+      <w:tr>
+        <w:tc>
+          <w:tcPr>
+            <w:tcW w:type="dxa" w:w="2880"/>
+          </w:tcPr>
+          <w:p>
+            <w:r>
+              <w:rPr>
+                <w:sz w:val="18"/>
+              </w:rPr>
+              <w:t>Порт</w:t>
+            </w:r>
+          </w:p>
+        </w:tc>
+        <w:tc>
+          <w:tcPr>
+            <w:tcW w:type="dxa" w:w="2880"/>
+          </w:tcPr>
+          <w:p/>
+        </w:tc>
+        <w:tc>
+          <w:tcPr>
+            <w:tcW w:type="dxa" w:w="2880"/>
+          </w:tcPr>
+          <w:p/>
+        </w:tc>
+      </w:tr>
+      <w:tr>
+        <w:tc>
+          <w:tcPr>
+            <w:tcW w:type="dxa" w:w="2880"/>
+          </w:tcPr>
+          <w:p>
+            <w:r>
+              <w:rPr>
+                <w:sz w:val="18"/>
+              </w:rPr>
+              <w:t>Файл unit</w:t>
+            </w:r>
+          </w:p>
+        </w:tc>
+        <w:tc>
+          <w:tcPr>
+            <w:tcW w:type="dxa" w:w="2880"/>
+          </w:tcPr>
+          <w:p/>
+        </w:tc>
+        <w:tc>
+          <w:tcPr>
+            <w:tcW w:type="dxa" w:w="2880"/>
+          </w:tcPr>
+          <w:p/>
+        </w:tc>
+      </w:tr>
+      <w:tr>
+        <w:tc>
+          <w:tcPr>
+            <w:tcW w:type="dxa" w:w="2880"/>
+          </w:tcPr>
+          <w:p>
+            <w:r>
+              <w:rPr>
+                <w:sz w:val="18"/>
+              </w:rPr>
+              <w:t>Правило firewall</w:t>
+            </w:r>
+          </w:p>
+        </w:tc>
+        <w:tc>
+          <w:tcPr>
+            <w:tcW w:type="dxa" w:w="2880"/>
+          </w:tcPr>
+          <w:p/>
+        </w:tc>
+        <w:tc>
+          <w:tcPr>
+            <w:tcW w:type="dxa" w:w="2880"/>
+          </w:tcPr>
+          <w:p/>
+        </w:tc>
+      </w:tr>
+      <w:tr>
+        <w:tc>
+          <w:tcPr>
+            <w:tcW w:type="dxa" w:w="2880"/>
+          </w:tcPr>
+          <w:p>
+            <w:r>
+              <w:rPr>
+                <w:sz w:val="18"/>
+              </w:rPr>
+              <w:t>Проброс порта</w:t>
+            </w:r>
+          </w:p>
+        </w:tc>
+        <w:tc>
+          <w:tcPr>
+            <w:tcW w:type="dxa" w:w="2880"/>
+          </w:tcPr>
+          <w:p/>
+        </w:tc>
+        <w:tc>
+          <w:tcPr>
+            <w:tcW w:type="dxa" w:w="2880"/>
+          </w:tcPr>
+          <w:p/>
+        </w:tc>
+      </w:tr>
+    </w:tbl>
+    <w:p/>
     <w:p>
       <w:r>
-        <w:t>Виртуальная машина: uifis-srv01. Сеть: VirtualBox NAT, проброс TCP 8080 на 8080. Служба: uifis-web.</w:t>
-      </w:r>
-    </w:p>
-    <w:p>
-      <w:pPr>
-        <w:pStyle w:val="Heading1"/>
-      </w:pPr>
-      <w:r>
-        <w:t>2. Служба</w:t>
-      </w:r>
-    </w:p>
-    <w:p>
-      <w:r>
-        <w:t>Файл /etc/systemd/system/uifis-web.service:</w:t>
-      </w:r>
-    </w:p>
-    <w:p>
-      <w:r>
-        <w:t>[Unit]</w:t>
-        <w:br/>
-        <w:t>Description=UIFIS training web service</w:t>
-        <w:br/>
-        <w:t>After=network.target</w:t>
-        <w:br/>
-        <w:br/>
-        <w:t>[Service]</w:t>
-        <w:br/>
-        <w:t>Type=simple</w:t>
-        <w:br/>
-        <w:t>User=uifis</w:t>
-        <w:br/>
-        <w:t>Group=uifis</w:t>
-        <w:br/>
-        <w:t>WorkingDirectory=/srv/uifis-web</w:t>
-        <w:br/>
-        <w:t>ExecStart=/usr/bin/python3 -m http.server 8080 --bind 0.0.0.0 --directory /srv/uifis-web</w:t>
-        <w:br/>
-        <w:t>Restart=on-failure</w:t>
-        <w:br/>
-        <w:t>RestartSec=3</w:t>
-        <w:br/>
-        <w:br/>
-        <w:t>[Install]</w:t>
-        <w:br/>
-        <w:t>WantedBy=multi-user.target</w:t>
-      </w:r>
-    </w:p>
-    <w:p>
-      <w:pPr>
-        <w:pStyle w:val="Heading1"/>
-      </w:pPr>
-      <w:r>
-        <w:t>3. Проверки</w:t>
+        <w:rPr>
+          <w:b/>
+          <w:sz w:val="24"/>
+        </w:rPr>
+        <w:t>Проверки</w:t>
       </w:r>
     </w:p>
     <w:tbl>
@@ -139,6 +1198,9 @@
           </w:tcPr>
           <w:p>
             <w:r>
+              <w:rPr>
+                <w:sz w:val="16"/>
+              </w:rPr>
               <w:t>Проверка</w:t>
             </w:r>
           </w:p>
@@ -149,6 +1211,9 @@
           </w:tcPr>
           <w:p>
             <w:r>
+              <w:rPr>
+                <w:sz w:val="16"/>
+              </w:rPr>
               <w:t>Команда</w:t>
             </w:r>
           </w:p>
@@ -159,6 +1224,9 @@
           </w:tcPr>
           <w:p>
             <w:r>
+              <w:rPr>
+                <w:sz w:val="16"/>
+              </w:rPr>
               <w:t>Ожидаемый результат</w:t>
             </w:r>
           </w:p>
@@ -169,7 +1237,10 @@
           </w:tcPr>
           <w:p>
             <w:r>
-              <w:t>Фактический результат</w:t>
+              <w:rPr>
+                <w:sz w:val="16"/>
+              </w:rPr>
+              <w:t>Факт</w:t>
             </w:r>
           </w:p>
         </w:tc>
@@ -179,7 +1250,10 @@
           </w:tcPr>
           <w:p>
             <w:r>
-              <w:t>Отметка</w:t>
+              <w:rPr>
+                <w:sz w:val="16"/>
+              </w:rPr>
+              <w:t>Вывод</w:t>
             </w:r>
           </w:p>
         </w:tc>
@@ -191,6 +1265,9 @@
           </w:tcPr>
           <w:p>
             <w:r>
+              <w:rPr>
+                <w:sz w:val="16"/>
+              </w:rPr>
               <w:t>Каталог</w:t>
             </w:r>
           </w:p>
@@ -201,6 +1278,9 @@
           </w:tcPr>
           <w:p>
             <w:r>
+              <w:rPr>
+                <w:sz w:val="16"/>
+              </w:rPr>
               <w:t>ls -ld /srv/uifis-web</w:t>
             </w:r>
           </w:p>
@@ -211,6 +1291,9 @@
           </w:tcPr>
           <w:p>
             <w:r>
+              <w:rPr>
+                <w:sz w:val="16"/>
+              </w:rPr>
               <w:t>владелец uifis, права 0750</w:t>
             </w:r>
           </w:p>
@@ -235,6 +1318,115 @@
           </w:tcPr>
           <w:p>
             <w:r>
+              <w:rPr>
+                <w:sz w:val="16"/>
+              </w:rPr>
+              <w:t>Файл</w:t>
+            </w:r>
+          </w:p>
+        </w:tc>
+        <w:tc>
+          <w:tcPr>
+            <w:tcW w:type="dxa" w:w="1728"/>
+          </w:tcPr>
+          <w:p>
+            <w:r>
+              <w:rPr>
+                <w:sz w:val="16"/>
+              </w:rPr>
+              <w:t>ls -l /srv/uifis-web/app.py</w:t>
+            </w:r>
+          </w:p>
+        </w:tc>
+        <w:tc>
+          <w:tcPr>
+            <w:tcW w:type="dxa" w:w="1728"/>
+          </w:tcPr>
+          <w:p>
+            <w:r>
+              <w:rPr>
+                <w:sz w:val="16"/>
+              </w:rPr>
+              <w:t>владелец uifis, права 0640</w:t>
+            </w:r>
+          </w:p>
+        </w:tc>
+        <w:tc>
+          <w:tcPr>
+            <w:tcW w:type="dxa" w:w="1728"/>
+          </w:tcPr>
+          <w:p/>
+        </w:tc>
+        <w:tc>
+          <w:tcPr>
+            <w:tcW w:type="dxa" w:w="1728"/>
+          </w:tcPr>
+          <w:p/>
+        </w:tc>
+      </w:tr>
+      <w:tr>
+        <w:tc>
+          <w:tcPr>
+            <w:tcW w:type="dxa" w:w="1728"/>
+          </w:tcPr>
+          <w:p>
+            <w:r>
+              <w:rPr>
+                <w:sz w:val="16"/>
+              </w:rPr>
+              <w:t>Синтаксис</w:t>
+            </w:r>
+          </w:p>
+        </w:tc>
+        <w:tc>
+          <w:tcPr>
+            <w:tcW w:type="dxa" w:w="1728"/>
+          </w:tcPr>
+          <w:p>
+            <w:r>
+              <w:rPr>
+                <w:sz w:val="16"/>
+              </w:rPr>
+              <w:t>sudo -u uifis python3 -m py_compile /srv/uifis-web/app.py</w:t>
+            </w:r>
+          </w:p>
+        </w:tc>
+        <w:tc>
+          <w:tcPr>
+            <w:tcW w:type="dxa" w:w="1728"/>
+          </w:tcPr>
+          <w:p>
+            <w:r>
+              <w:rPr>
+                <w:sz w:val="16"/>
+              </w:rPr>
+              <w:t>без ошибок</w:t>
+            </w:r>
+          </w:p>
+        </w:tc>
+        <w:tc>
+          <w:tcPr>
+            <w:tcW w:type="dxa" w:w="1728"/>
+          </w:tcPr>
+          <w:p/>
+        </w:tc>
+        <w:tc>
+          <w:tcPr>
+            <w:tcW w:type="dxa" w:w="1728"/>
+          </w:tcPr>
+          <w:p/>
+        </w:tc>
+      </w:tr>
+      <w:tr>
+        <w:tc>
+          <w:tcPr>
+            <w:tcW w:type="dxa" w:w="1728"/>
+          </w:tcPr>
+          <w:p>
+            <w:r>
+              <w:rPr>
+                <w:sz w:val="16"/>
+              </w:rPr>
               <w:t>Служба</w:t>
             </w:r>
           </w:p>
@@ -245,6 +1437,9 @@
           </w:tcPr>
           <w:p>
             <w:r>
+              <w:rPr>
+                <w:sz w:val="16"/>
+              </w:rPr>
               <w:t>systemctl status uifis-web</w:t>
             </w:r>
           </w:p>
@@ -255,6 +1450,9 @@
           </w:tcPr>
           <w:p>
             <w:r>
+              <w:rPr>
+                <w:sz w:val="16"/>
+              </w:rPr>
               <w:t>active (running)</w:t>
             </w:r>
           </w:p>
@@ -279,6 +1477,9 @@
           </w:tcPr>
           <w:p>
             <w:r>
+              <w:rPr>
+                <w:sz w:val="16"/>
+              </w:rPr>
               <w:t>Автозапуск</w:t>
             </w:r>
           </w:p>
@@ -289,6 +1490,9 @@
           </w:tcPr>
           <w:p>
             <w:r>
+              <w:rPr>
+                <w:sz w:val="16"/>
+              </w:rPr>
               <w:t>systemctl is-enabled uifis-web</w:t>
             </w:r>
           </w:p>
@@ -299,6 +1503,9 @@
           </w:tcPr>
           <w:p>
             <w:r>
+              <w:rPr>
+                <w:sz w:val="16"/>
+              </w:rPr>
               <w:t>enabled</w:t>
             </w:r>
           </w:p>
@@ -323,6 +1530,9 @@
           </w:tcPr>
           <w:p>
             <w:r>
+              <w:rPr>
+                <w:sz w:val="16"/>
+              </w:rPr>
               <w:t>Порт</w:t>
             </w:r>
           </w:p>
@@ -333,6 +1543,9 @@
           </w:tcPr>
           <w:p>
             <w:r>
+              <w:rPr>
+                <w:sz w:val="16"/>
+              </w:rPr>
               <w:t>ss -tulpn | grep 8080</w:t>
             </w:r>
           </w:p>
@@ -343,6 +1556,9 @@
           </w:tcPr>
           <w:p>
             <w:r>
+              <w:rPr>
+                <w:sz w:val="16"/>
+              </w:rPr>
               <w:t>0.0.0.0:8080</w:t>
             </w:r>
           </w:p>
@@ -367,7 +1583,10 @@
           </w:tcPr>
           <w:p>
             <w:r>
-              <w:t>Локальный JSON</w:t>
+              <w:rPr>
+                <w:sz w:val="16"/>
+              </w:rPr>
+              <w:t>Главная</w:t>
             </w:r>
           </w:p>
         </w:tc>
@@ -377,6 +1596,62 @@
           </w:tcPr>
           <w:p>
             <w:r>
+              <w:rPr>
+                <w:sz w:val="16"/>
+              </w:rPr>
+              <w:t>curl -i http://127.0.0.1:8080/</w:t>
+            </w:r>
+          </w:p>
+        </w:tc>
+        <w:tc>
+          <w:tcPr>
+            <w:tcW w:type="dxa" w:w="1728"/>
+          </w:tcPr>
+          <w:p>
+            <w:r>
+              <w:rPr>
+                <w:sz w:val="16"/>
+              </w:rPr>
+              <w:t>200 OK, HTML</w:t>
+            </w:r>
+          </w:p>
+        </w:tc>
+        <w:tc>
+          <w:tcPr>
+            <w:tcW w:type="dxa" w:w="1728"/>
+          </w:tcPr>
+          <w:p/>
+        </w:tc>
+        <w:tc>
+          <w:tcPr>
+            <w:tcW w:type="dxa" w:w="1728"/>
+          </w:tcPr>
+          <w:p/>
+        </w:tc>
+      </w:tr>
+      <w:tr>
+        <w:tc>
+          <w:tcPr>
+            <w:tcW w:type="dxa" w:w="1728"/>
+          </w:tcPr>
+          <w:p>
+            <w:r>
+              <w:rPr>
+                <w:sz w:val="16"/>
+              </w:rPr>
+              <w:t>Здоровье</w:t>
+            </w:r>
+          </w:p>
+        </w:tc>
+        <w:tc>
+          <w:tcPr>
+            <w:tcW w:type="dxa" w:w="1728"/>
+          </w:tcPr>
+          <w:p>
+            <w:r>
+              <w:rPr>
+                <w:sz w:val="16"/>
+              </w:rPr>
               <w:t>curl -i http://127.0.0.1:8080/health.json</w:t>
             </w:r>
           </w:p>
@@ -387,6 +1662,9 @@
           </w:tcPr>
           <w:p>
             <w:r>
+              <w:rPr>
+                <w:sz w:val="16"/>
+              </w:rPr>
               <w:t>200 OK, status ok</w:t>
             </w:r>
           </w:p>
@@ -411,7 +1689,10 @@
           </w:tcPr>
           <w:p>
             <w:r>
-              <w:t>Firewall</w:t>
+              <w:rPr>
+                <w:sz w:val="16"/>
+              </w:rPr>
+              <w:t>Каталог API</w:t>
             </w:r>
           </w:p>
         </w:tc>
@@ -421,7 +1702,10 @@
           </w:tcPr>
           <w:p>
             <w:r>
-              <w:t>sudo ufw status verbose</w:t>
+              <w:rPr>
+                <w:sz w:val="16"/>
+              </w:rPr>
+              <w:t>curl -i http://127.0.0.1:8080/api/services</w:t>
             </w:r>
           </w:p>
         </w:tc>
@@ -431,7 +1715,10 @@
           </w:tcPr>
           <w:p>
             <w:r>
-              <w:t>разрешён 8080/tcp</w:t>
+              <w:rPr>
+                <w:sz w:val="16"/>
+              </w:rPr>
+              <w:t>count равно 4</w:t>
             </w:r>
           </w:p>
         </w:tc>
@@ -455,7 +1742,10 @@
           </w:tcPr>
           <w:p>
             <w:r>
-              <w:t>Проброс порта</w:t>
+              <w:rPr>
+                <w:sz w:val="16"/>
+              </w:rPr>
+              <w:t>Ошибка</w:t>
             </w:r>
           </w:p>
         </w:tc>
@@ -465,6 +1755,168 @@
           </w:tcPr>
           <w:p>
             <w:r>
+              <w:rPr>
+                <w:sz w:val="16"/>
+              </w:rPr>
+              <w:t>curl -i http://127.0.0.1:8080/missing</w:t>
+            </w:r>
+          </w:p>
+        </w:tc>
+        <w:tc>
+          <w:tcPr>
+            <w:tcW w:type="dxa" w:w="1728"/>
+          </w:tcPr>
+          <w:p>
+            <w:r>
+              <w:rPr>
+                <w:sz w:val="16"/>
+              </w:rPr>
+              <w:t>404 Not Found</w:t>
+            </w:r>
+          </w:p>
+        </w:tc>
+        <w:tc>
+          <w:tcPr>
+            <w:tcW w:type="dxa" w:w="1728"/>
+          </w:tcPr>
+          <w:p/>
+        </w:tc>
+        <w:tc>
+          <w:tcPr>
+            <w:tcW w:type="dxa" w:w="1728"/>
+          </w:tcPr>
+          <w:p/>
+        </w:tc>
+      </w:tr>
+      <w:tr>
+        <w:tc>
+          <w:tcPr>
+            <w:tcW w:type="dxa" w:w="1728"/>
+          </w:tcPr>
+          <w:p>
+            <w:r>
+              <w:rPr>
+                <w:sz w:val="16"/>
+              </w:rPr>
+              <w:t>Журнал</w:t>
+            </w:r>
+          </w:p>
+        </w:tc>
+        <w:tc>
+          <w:tcPr>
+            <w:tcW w:type="dxa" w:w="1728"/>
+          </w:tcPr>
+          <w:p>
+            <w:r>
+              <w:rPr>
+                <w:sz w:val="16"/>
+              </w:rPr>
+              <w:t>journalctl -u uifis-web -n 30 --no-pager</w:t>
+            </w:r>
+          </w:p>
+        </w:tc>
+        <w:tc>
+          <w:tcPr>
+            <w:tcW w:type="dxa" w:w="1728"/>
+          </w:tcPr>
+          <w:p>
+            <w:r>
+              <w:rPr>
+                <w:sz w:val="16"/>
+              </w:rPr>
+              <w:t>строки запуска и запросов</w:t>
+            </w:r>
+          </w:p>
+        </w:tc>
+        <w:tc>
+          <w:tcPr>
+            <w:tcW w:type="dxa" w:w="1728"/>
+          </w:tcPr>
+          <w:p/>
+        </w:tc>
+        <w:tc>
+          <w:tcPr>
+            <w:tcW w:type="dxa" w:w="1728"/>
+          </w:tcPr>
+          <w:p/>
+        </w:tc>
+      </w:tr>
+      <w:tr>
+        <w:tc>
+          <w:tcPr>
+            <w:tcW w:type="dxa" w:w="1728"/>
+          </w:tcPr>
+          <w:p>
+            <w:r>
+              <w:rPr>
+                <w:sz w:val="16"/>
+              </w:rPr>
+              <w:t>Firewall</w:t>
+            </w:r>
+          </w:p>
+        </w:tc>
+        <w:tc>
+          <w:tcPr>
+            <w:tcW w:type="dxa" w:w="1728"/>
+          </w:tcPr>
+          <w:p>
+            <w:r>
+              <w:rPr>
+                <w:sz w:val="16"/>
+              </w:rPr>
+              <w:t>sudo ufw status verbose</w:t>
+            </w:r>
+          </w:p>
+        </w:tc>
+        <w:tc>
+          <w:tcPr>
+            <w:tcW w:type="dxa" w:w="1728"/>
+          </w:tcPr>
+          <w:p>
+            <w:r>
+              <w:rPr>
+                <w:sz w:val="16"/>
+              </w:rPr>
+              <w:t>8080/tcp из 10.0.2.0/24</w:t>
+            </w:r>
+          </w:p>
+        </w:tc>
+        <w:tc>
+          <w:tcPr>
+            <w:tcW w:type="dxa" w:w="1728"/>
+          </w:tcPr>
+          <w:p/>
+        </w:tc>
+        <w:tc>
+          <w:tcPr>
+            <w:tcW w:type="dxa" w:w="1728"/>
+          </w:tcPr>
+          <w:p/>
+        </w:tc>
+      </w:tr>
+      <w:tr>
+        <w:tc>
+          <w:tcPr>
+            <w:tcW w:type="dxa" w:w="1728"/>
+          </w:tcPr>
+          <w:p>
+            <w:r>
+              <w:rPr>
+                <w:sz w:val="16"/>
+              </w:rPr>
+              <w:t>Проброс</w:t>
+            </w:r>
+          </w:p>
+        </w:tc>
+        <w:tc>
+          <w:tcPr>
+            <w:tcW w:type="dxa" w:w="1728"/>
+          </w:tcPr>
+          <w:p>
+            <w:r>
+              <w:rPr>
+                <w:sz w:val="16"/>
+              </w:rPr>
               <w:t>VirtualBox → Проброс портов</w:t>
             </w:r>
           </w:p>
@@ -475,6 +1927,9 @@
           </w:tcPr>
           <w:p>
             <w:r>
+              <w:rPr>
+                <w:sz w:val="16"/>
+              </w:rPr>
               <w:t>TCP 8080 на 8080</w:t>
             </w:r>
           </w:p>
@@ -499,6 +1954,9 @@
           </w:tcPr>
           <w:p>
             <w:r>
+              <w:rPr>
+                <w:sz w:val="16"/>
+              </w:rPr>
               <w:t>С хоста</w:t>
             </w:r>
           </w:p>
@@ -509,7 +1967,10 @@
           </w:tcPr>
           <w:p>
             <w:r>
-              <w:t>Invoke-WebRequest http://127.0.0.1:8080/health.json</w:t>
+              <w:rPr>
+                <w:sz w:val="16"/>
+              </w:rPr>
+              <w:t>curl.exe -i http://127.0.0.1:8080/health.json</w:t>
             </w:r>
           </w:p>
         </w:tc>
@@ -519,6 +1980,9 @@
           </w:tcPr>
           <w:p>
             <w:r>
+              <w:rPr>
+                <w:sz w:val="16"/>
+              </w:rPr>
               <w:t>JSON получен</w:t>
             </w:r>
           </w:p>
@@ -536,106 +2000,828 @@
           <w:p/>
         </w:tc>
       </w:tr>
+      <w:tr>
+        <w:tc>
+          <w:tcPr>
+            <w:tcW w:type="dxa" w:w="1728"/>
+          </w:tcPr>
+          <w:p>
+            <w:r>
+              <w:rPr>
+                <w:sz w:val="16"/>
+              </w:rPr>
+              <w:t>Отказ</w:t>
+            </w:r>
+          </w:p>
+        </w:tc>
+        <w:tc>
+          <w:tcPr>
+            <w:tcW w:type="dxa" w:w="1728"/>
+          </w:tcPr>
+          <w:p>
+            <w:r>
+              <w:rPr>
+                <w:sz w:val="16"/>
+              </w:rPr>
+              <w:t>systemctl stop uifis-web</w:t>
+            </w:r>
+          </w:p>
+        </w:tc>
+        <w:tc>
+          <w:tcPr>
+            <w:tcW w:type="dxa" w:w="1728"/>
+          </w:tcPr>
+          <w:p>
+            <w:r>
+              <w:rPr>
+                <w:sz w:val="16"/>
+              </w:rPr>
+              <w:t>служба не отвечает</w:t>
+            </w:r>
+          </w:p>
+        </w:tc>
+        <w:tc>
+          <w:tcPr>
+            <w:tcW w:type="dxa" w:w="1728"/>
+          </w:tcPr>
+          <w:p/>
+        </w:tc>
+        <w:tc>
+          <w:tcPr>
+            <w:tcW w:type="dxa" w:w="1728"/>
+          </w:tcPr>
+          <w:p/>
+        </w:tc>
+      </w:tr>
+      <w:tr>
+        <w:tc>
+          <w:tcPr>
+            <w:tcW w:type="dxa" w:w="1728"/>
+          </w:tcPr>
+          <w:p>
+            <w:r>
+              <w:rPr>
+                <w:sz w:val="16"/>
+              </w:rPr>
+              <w:t>Восстановление</w:t>
+            </w:r>
+          </w:p>
+        </w:tc>
+        <w:tc>
+          <w:tcPr>
+            <w:tcW w:type="dxa" w:w="1728"/>
+          </w:tcPr>
+          <w:p>
+            <w:r>
+              <w:rPr>
+                <w:sz w:val="16"/>
+              </w:rPr>
+              <w:t>systemctl start uifis-web</w:t>
+            </w:r>
+          </w:p>
+        </w:tc>
+        <w:tc>
+          <w:tcPr>
+            <w:tcW w:type="dxa" w:w="1728"/>
+          </w:tcPr>
+          <w:p>
+            <w:r>
+              <w:rPr>
+                <w:sz w:val="16"/>
+              </w:rPr>
+              <w:t>снова 200 OK</w:t>
+            </w:r>
+          </w:p>
+        </w:tc>
+        <w:tc>
+          <w:tcPr>
+            <w:tcW w:type="dxa" w:w="1728"/>
+          </w:tcPr>
+          <w:p/>
+        </w:tc>
+        <w:tc>
+          <w:tcPr>
+            <w:tcW w:type="dxa" w:w="1728"/>
+          </w:tcPr>
+          <w:p/>
+        </w:tc>
+      </w:tr>
     </w:tbl>
+    <w:p/>
+    <w:p>
+      <w:r>
+        <w:rPr>
+          <w:b/>
+          <w:sz w:val="24"/>
+        </w:rPr>
+        <w:t>Отказы и восстановление</w:t>
+      </w:r>
+    </w:p>
+    <w:tbl>
+      <w:tblPr>
+        <w:tblStyle w:val="TableGrid"/>
+        <w:tblW w:type="auto" w:w="0"/>
+        <w:tblLook w:firstColumn="1" w:firstRow="1" w:lastColumn="0" w:lastRow="0" w:noHBand="0" w:noVBand="1" w:val="04A0"/>
+      </w:tblPr>
+      <w:tblGrid>
+        <w:gridCol w:w="1728"/>
+        <w:gridCol w:w="1728"/>
+        <w:gridCol w:w="1728"/>
+        <w:gridCol w:w="1728"/>
+        <w:gridCol w:w="1728"/>
+      </w:tblGrid>
+      <w:tr>
+        <w:tc>
+          <w:tcPr>
+            <w:tcW w:type="dxa" w:w="1728"/>
+          </w:tcPr>
+          <w:p>
+            <w:r>
+              <w:rPr>
+                <w:sz w:val="16"/>
+              </w:rPr>
+              <w:t>Отказ</w:t>
+            </w:r>
+          </w:p>
+        </w:tc>
+        <w:tc>
+          <w:tcPr>
+            <w:tcW w:type="dxa" w:w="1728"/>
+          </w:tcPr>
+          <w:p>
+            <w:r>
+              <w:rPr>
+                <w:sz w:val="16"/>
+              </w:rPr>
+              <w:t>Симптом</w:t>
+            </w:r>
+          </w:p>
+        </w:tc>
+        <w:tc>
+          <w:tcPr>
+            <w:tcW w:type="dxa" w:w="1728"/>
+          </w:tcPr>
+          <w:p>
+            <w:r>
+              <w:rPr>
+                <w:sz w:val="16"/>
+              </w:rPr>
+              <w:t>Проверка</w:t>
+            </w:r>
+          </w:p>
+        </w:tc>
+        <w:tc>
+          <w:tcPr>
+            <w:tcW w:type="dxa" w:w="1728"/>
+          </w:tcPr>
+          <w:p>
+            <w:r>
+              <w:rPr>
+                <w:sz w:val="16"/>
+              </w:rPr>
+              <w:t>Причина</w:t>
+            </w:r>
+          </w:p>
+        </w:tc>
+        <w:tc>
+          <w:tcPr>
+            <w:tcW w:type="dxa" w:w="1728"/>
+          </w:tcPr>
+          <w:p>
+            <w:r>
+              <w:rPr>
+                <w:sz w:val="16"/>
+              </w:rPr>
+              <w:t>Восстановление</w:t>
+            </w:r>
+          </w:p>
+        </w:tc>
+      </w:tr>
+      <w:tr>
+        <w:tc>
+          <w:tcPr>
+            <w:tcW w:type="dxa" w:w="1728"/>
+          </w:tcPr>
+          <w:p>
+            <w:r>
+              <w:rPr>
+                <w:sz w:val="16"/>
+              </w:rPr>
+              <w:t>Служба остановлена</w:t>
+            </w:r>
+          </w:p>
+        </w:tc>
+        <w:tc>
+          <w:tcPr>
+            <w:tcW w:type="dxa" w:w="1728"/>
+          </w:tcPr>
+          <w:p/>
+        </w:tc>
+        <w:tc>
+          <w:tcPr>
+            <w:tcW w:type="dxa" w:w="1728"/>
+          </w:tcPr>
+          <w:p/>
+        </w:tc>
+        <w:tc>
+          <w:tcPr>
+            <w:tcW w:type="dxa" w:w="1728"/>
+          </w:tcPr>
+          <w:p/>
+        </w:tc>
+        <w:tc>
+          <w:tcPr>
+            <w:tcW w:type="dxa" w:w="1728"/>
+          </w:tcPr>
+          <w:p/>
+        </w:tc>
+      </w:tr>
+      <w:tr>
+        <w:tc>
+          <w:tcPr>
+            <w:tcW w:type="dxa" w:w="1728"/>
+          </w:tcPr>
+          <w:p>
+            <w:r>
+              <w:rPr>
+                <w:sz w:val="16"/>
+              </w:rPr>
+              <w:t>Служба слушает 127.0.0.1</w:t>
+            </w:r>
+          </w:p>
+        </w:tc>
+        <w:tc>
+          <w:tcPr>
+            <w:tcW w:type="dxa" w:w="1728"/>
+          </w:tcPr>
+          <w:p/>
+        </w:tc>
+        <w:tc>
+          <w:tcPr>
+            <w:tcW w:type="dxa" w:w="1728"/>
+          </w:tcPr>
+          <w:p/>
+        </w:tc>
+        <w:tc>
+          <w:tcPr>
+            <w:tcW w:type="dxa" w:w="1728"/>
+          </w:tcPr>
+          <w:p/>
+        </w:tc>
+        <w:tc>
+          <w:tcPr>
+            <w:tcW w:type="dxa" w:w="1728"/>
+          </w:tcPr>
+          <w:p/>
+        </w:tc>
+      </w:tr>
+      <w:tr>
+        <w:tc>
+          <w:tcPr>
+            <w:tcW w:type="dxa" w:w="1728"/>
+          </w:tcPr>
+          <w:p>
+            <w:r>
+              <w:rPr>
+                <w:sz w:val="16"/>
+              </w:rPr>
+              <w:t>Порт закрыт firewall</w:t>
+            </w:r>
+          </w:p>
+        </w:tc>
+        <w:tc>
+          <w:tcPr>
+            <w:tcW w:type="dxa" w:w="1728"/>
+          </w:tcPr>
+          <w:p/>
+        </w:tc>
+        <w:tc>
+          <w:tcPr>
+            <w:tcW w:type="dxa" w:w="1728"/>
+          </w:tcPr>
+          <w:p/>
+        </w:tc>
+        <w:tc>
+          <w:tcPr>
+            <w:tcW w:type="dxa" w:w="1728"/>
+          </w:tcPr>
+          <w:p/>
+        </w:tc>
+        <w:tc>
+          <w:tcPr>
+            <w:tcW w:type="dxa" w:w="1728"/>
+          </w:tcPr>
+          <w:p/>
+        </w:tc>
+      </w:tr>
+      <w:tr>
+        <w:tc>
+          <w:tcPr>
+            <w:tcW w:type="dxa" w:w="1728"/>
+          </w:tcPr>
+          <w:p>
+            <w:r>
+              <w:rPr>
+                <w:sz w:val="16"/>
+              </w:rPr>
+              <w:t>Проброс ведёт на 8081</w:t>
+            </w:r>
+          </w:p>
+        </w:tc>
+        <w:tc>
+          <w:tcPr>
+            <w:tcW w:type="dxa" w:w="1728"/>
+          </w:tcPr>
+          <w:p/>
+        </w:tc>
+        <w:tc>
+          <w:tcPr>
+            <w:tcW w:type="dxa" w:w="1728"/>
+          </w:tcPr>
+          <w:p/>
+        </w:tc>
+        <w:tc>
+          <w:tcPr>
+            <w:tcW w:type="dxa" w:w="1728"/>
+          </w:tcPr>
+          <w:p/>
+        </w:tc>
+        <w:tc>
+          <w:tcPr>
+            <w:tcW w:type="dxa" w:w="1728"/>
+          </w:tcPr>
+          <w:p/>
+        </w:tc>
+      </w:tr>
+      <w:tr>
+        <w:tc>
+          <w:tcPr>
+            <w:tcW w:type="dxa" w:w="1728"/>
+          </w:tcPr>
+          <w:p>
+            <w:r>
+              <w:rPr>
+                <w:sz w:val="16"/>
+              </w:rPr>
+              <w:t>Файл app.py недоступен</w:t>
+            </w:r>
+          </w:p>
+        </w:tc>
+        <w:tc>
+          <w:tcPr>
+            <w:tcW w:type="dxa" w:w="1728"/>
+          </w:tcPr>
+          <w:p/>
+        </w:tc>
+        <w:tc>
+          <w:tcPr>
+            <w:tcW w:type="dxa" w:w="1728"/>
+          </w:tcPr>
+          <w:p/>
+        </w:tc>
+        <w:tc>
+          <w:tcPr>
+            <w:tcW w:type="dxa" w:w="1728"/>
+          </w:tcPr>
+          <w:p/>
+        </w:tc>
+        <w:tc>
+          <w:tcPr>
+            <w:tcW w:type="dxa" w:w="1728"/>
+          </w:tcPr>
+          <w:p/>
+        </w:tc>
+      </w:tr>
+    </w:tbl>
+    <w:p/>
+    <w:p>
+      <w:r>
+        <w:rPr>
+          <w:b/>
+          <w:sz w:val="24"/>
+        </w:rPr>
+        <w:t>Скриншоты</w:t>
+      </w:r>
+    </w:p>
     <w:p>
       <w:pPr>
-        <w:pStyle w:val="Heading1"/>
+        <w:jc w:val="center"/>
       </w:pPr>
       <w:r>
-        <w:t>4. Отказ и восстановление</w:t>
+        <w:rPr>
+          <w:i/>
+          <w:sz w:val="22"/>
+        </w:rPr>
+        <w:t>[ Место для скриншота: Вывод systemctl status uifis-web ]</w:t>
+      </w:r>
+    </w:p>
+    <w:p/>
+    <w:p>
+      <w:pPr>
+        <w:jc w:val="center"/>
+      </w:pPr>
+      <w:r>
+        <w:rPr>
+          <w:i/>
+          <w:sz w:val="22"/>
+        </w:rPr>
+        <w:t>[ Место для скриншота: Вывод ss -tulpn с адресом 0.0.0.0:8080 ]</w:t>
+      </w:r>
+    </w:p>
+    <w:p/>
+    <w:p>
+      <w:pPr>
+        <w:jc w:val="center"/>
+      </w:pPr>
+      <w:r>
+        <w:rPr>
+          <w:i/>
+          <w:sz w:val="22"/>
+        </w:rPr>
+        <w:t>[ Место для скриншота: Ответы /, /health.json и /api/services из гостевой системы ]</w:t>
+      </w:r>
+    </w:p>
+    <w:p/>
+    <w:p>
+      <w:pPr>
+        <w:jc w:val="center"/>
+      </w:pPr>
+      <w:r>
+        <w:rPr>
+          <w:i/>
+          <w:sz w:val="22"/>
+        </w:rPr>
+        <w:t>[ Место для скриншота: Ответ curl.exe с рабочего компьютера ]</w:t>
+      </w:r>
+    </w:p>
+    <w:p/>
+    <w:p>
+      <w:pPr>
+        <w:jc w:val="center"/>
+      </w:pPr>
+      <w:r>
+        <w:rPr>
+          <w:i/>
+          <w:sz w:val="22"/>
+        </w:rPr>
+        <w:t>[ Место для скриншота: Правило проброса портов в VirtualBox ]</w:t>
+      </w:r>
+    </w:p>
+    <w:p/>
+    <w:p>
+      <w:pPr>
+        <w:jc w:val="center"/>
+      </w:pPr>
+      <w:r>
+        <w:rPr>
+          <w:i/>
+          <w:sz w:val="22"/>
+        </w:rPr>
+        <w:t>[ Место для скриншота: Один отказ и его восстановление ]</w:t>
+      </w:r>
+    </w:p>
+    <w:p/>
+    <w:p>
+      <w:r>
+        <w:rPr>
+          <w:b/>
+          <w:sz w:val="24"/>
+        </w:rPr>
+        <w:t>Вывод</w:t>
       </w:r>
     </w:p>
     <w:p>
       <w:r>
-        <w:t>Остановка службы. Фактический результат запроса. Запуск службы. Результат повторной проверки. Фрагмент journalctl.</w:t>
-      </w:r>
-    </w:p>
-    <w:p>
-      <w:pPr>
-        <w:pStyle w:val="Heading1"/>
-      </w:pPr>
-      <w:r>
-        <w:t>5. Вывод</w:t>
+        <w:rPr>
+          <w:b w:val="0"/>
+          <w:sz w:val="24"/>
+        </w:rPr>
+        <w:t>Какая зависимость оказалась критичной для доступа к службе? Почему локальная проверка не заменяет проверку с хоста? Чем systemd удобнее ручного запуска?</w:t>
       </w:r>
     </w:p>
     <w:p>
       <w:r>
-        <w:t>Какая зависимость оказалась критичной для доступа к службе. Что проверено и какие команды использованы.</w:t>
-      </w:r>
-    </w:p>
-    <w:p>
-      <w:pPr>
-        <w:pStyle w:val="Heading1"/>
-      </w:pPr>
-      <w:r>
-        <w:t>6. Контрольные вопросы</w:t>
-      </w:r>
-    </w:p>
-    <w:p>
-      <w:pPr>
-        <w:pStyle w:val="ListNumber"/>
-      </w:pPr>
-      <w:r>
-        <w:t>Почему ручной запуск не считается полноценным развёртыванием?</w:t>
+        <w:rPr>
+          <w:b w:val="0"/>
+          <w:sz w:val="24"/>
+        </w:rPr>
+        <w:t>________________________________________________________________________</w:t>
       </w:r>
     </w:p>
     <w:p>
       <w:r>
-        <w:t>Ответ:</w:t>
-      </w:r>
-    </w:p>
-    <w:p>
-      <w:pPr>
-        <w:pStyle w:val="ListNumber"/>
-      </w:pPr>
-      <w:r>
-        <w:t>Зачем службе отдельный пользователь uifis?</w:t>
+        <w:rPr>
+          <w:b w:val="0"/>
+          <w:sz w:val="24"/>
+        </w:rPr>
+        <w:t>________________________________________________________________________</w:t>
       </w:r>
     </w:p>
     <w:p>
       <w:r>
-        <w:t>Ответ:</w:t>
-      </w:r>
-    </w:p>
-    <w:p>
-      <w:pPr>
-        <w:pStyle w:val="ListNumber"/>
-      </w:pPr>
-      <w:r>
-        <w:t>Что проверять, если служба активна, но с хоста не открывается?</w:t>
+        <w:rPr>
+          <w:b w:val="0"/>
+          <w:sz w:val="24"/>
+        </w:rPr>
+        <w:t>________________________________________________________________________</w:t>
       </w:r>
     </w:p>
     <w:p>
       <w:r>
-        <w:t>Ответ:</w:t>
-      </w:r>
-    </w:p>
-    <w:p>
-      <w:pPr>
-        <w:pStyle w:val="ListNumber"/>
-      </w:pPr>
-      <w:r>
-        <w:t>Почему недостаточно открыть порт в приложении?</w:t>
+        <w:rPr>
+          <w:b w:val="0"/>
+          <w:sz w:val="24"/>
+        </w:rPr>
+        <w:t>________________________________________________________________________</w:t>
       </w:r>
     </w:p>
     <w:p>
       <w:r>
-        <w:t>Ответ:</w:t>
-      </w:r>
-    </w:p>
-    <w:p>
-      <w:pPr>
-        <w:pStyle w:val="ListNumber"/>
-      </w:pPr>
-      <w:r>
-        <w:t>Чем проброс порта удобнее изменения настроек хоста?</w:t>
+        <w:rPr>
+          <w:b w:val="0"/>
+          <w:sz w:val="24"/>
+        </w:rPr>
+        <w:t>________________________________________________________________________</w:t>
       </w:r>
     </w:p>
     <w:p>
       <w:r>
-        <w:t>Ответ:</w:t>
+        <w:rPr>
+          <w:b w:val="0"/>
+          <w:sz w:val="24"/>
+        </w:rPr>
+        <w:t>________________________________________________________________________</w:t>
       </w:r>
     </w:p>
+    <w:p/>
+    <w:p>
+      <w:r>
+        <w:rPr>
+          <w:b/>
+          <w:sz w:val="24"/>
+        </w:rPr>
+        <w:t>Ответы на контрольные вопросы</w:t>
+      </w:r>
+    </w:p>
+    <w:p>
+      <w:r>
+        <w:rPr>
+          <w:b w:val="0"/>
+          <w:sz w:val="24"/>
+        </w:rPr>
+        <w:t>1. Почему ручной запуск python3 app.py не считается полноценным развёртыванием?</w:t>
+      </w:r>
+    </w:p>
+    <w:p>
+      <w:r>
+        <w:rPr>
+          <w:b w:val="0"/>
+          <w:sz w:val="24"/>
+        </w:rPr>
+        <w:t>________________________________________________________________________</w:t>
+      </w:r>
+    </w:p>
+    <w:p>
+      <w:r>
+        <w:rPr>
+          <w:b w:val="0"/>
+          <w:sz w:val="24"/>
+        </w:rPr>
+        <w:t>________________________________________________________________________</w:t>
+      </w:r>
+    </w:p>
+    <w:p>
+      <w:r>
+        <w:rPr>
+          <w:b w:val="0"/>
+          <w:sz w:val="24"/>
+        </w:rPr>
+        <w:t>________________________________________________________________________</w:t>
+      </w:r>
+    </w:p>
+    <w:p/>
+    <w:p>
+      <w:r>
+        <w:rPr>
+          <w:b w:val="0"/>
+          <w:sz w:val="24"/>
+        </w:rPr>
+        <w:t>2. Зачем службе отдельный пользователь uifis и права 0640 на файл?</w:t>
+      </w:r>
+    </w:p>
+    <w:p>
+      <w:r>
+        <w:rPr>
+          <w:b w:val="0"/>
+          <w:sz w:val="24"/>
+        </w:rPr>
+        <w:t>________________________________________________________________________</w:t>
+      </w:r>
+    </w:p>
+    <w:p>
+      <w:r>
+        <w:rPr>
+          <w:b w:val="0"/>
+          <w:sz w:val="24"/>
+        </w:rPr>
+        <w:t>________________________________________________________________________</w:t>
+      </w:r>
+    </w:p>
+    <w:p>
+      <w:r>
+        <w:rPr>
+          <w:b w:val="0"/>
+          <w:sz w:val="24"/>
+        </w:rPr>
+        <w:t>________________________________________________________________________</w:t>
+      </w:r>
+    </w:p>
+    <w:p/>
+    <w:p>
+      <w:r>
+        <w:rPr>
+          <w:b w:val="0"/>
+          <w:sz w:val="24"/>
+        </w:rPr>
+        <w:t>3. Что проверять, если служба активна, но с хоста не открывается?</w:t>
+      </w:r>
+    </w:p>
+    <w:p>
+      <w:r>
+        <w:rPr>
+          <w:b w:val="0"/>
+          <w:sz w:val="24"/>
+        </w:rPr>
+        <w:t>________________________________________________________________________</w:t>
+      </w:r>
+    </w:p>
+    <w:p>
+      <w:r>
+        <w:rPr>
+          <w:b w:val="0"/>
+          <w:sz w:val="24"/>
+        </w:rPr>
+        <w:t>________________________________________________________________________</w:t>
+      </w:r>
+    </w:p>
+    <w:p>
+      <w:r>
+        <w:rPr>
+          <w:b w:val="0"/>
+          <w:sz w:val="24"/>
+        </w:rPr>
+        <w:t>________________________________________________________________________</w:t>
+      </w:r>
+    </w:p>
+    <w:p/>
+    <w:p>
+      <w:r>
+        <w:rPr>
+          <w:b w:val="0"/>
+          <w:sz w:val="24"/>
+        </w:rPr>
+        <w:t>4. Почему недостаточно открыть порт в приложении, не проверив firewall?</w:t>
+      </w:r>
+    </w:p>
+    <w:p>
+      <w:r>
+        <w:rPr>
+          <w:b w:val="0"/>
+          <w:sz w:val="24"/>
+        </w:rPr>
+        <w:t>________________________________________________________________________</w:t>
+      </w:r>
+    </w:p>
+    <w:p>
+      <w:r>
+        <w:rPr>
+          <w:b w:val="0"/>
+          <w:sz w:val="24"/>
+        </w:rPr>
+        <w:t>________________________________________________________________________</w:t>
+      </w:r>
+    </w:p>
+    <w:p>
+      <w:r>
+        <w:rPr>
+          <w:b w:val="0"/>
+          <w:sz w:val="24"/>
+        </w:rPr>
+        <w:t>________________________________________________________________________</w:t>
+      </w:r>
+    </w:p>
+    <w:p/>
+    <w:p>
+      <w:r>
+        <w:rPr>
+          <w:b w:val="0"/>
+          <w:sz w:val="24"/>
+        </w:rPr>
+        <w:t>5. Чем 0.0.0.0:8080 отличается от 127.0.0.1:8080?</w:t>
+      </w:r>
+    </w:p>
+    <w:p>
+      <w:r>
+        <w:rPr>
+          <w:b w:val="0"/>
+          <w:sz w:val="24"/>
+        </w:rPr>
+        <w:t>________________________________________________________________________</w:t>
+      </w:r>
+    </w:p>
+    <w:p>
+      <w:r>
+        <w:rPr>
+          <w:b w:val="0"/>
+          <w:sz w:val="24"/>
+        </w:rPr>
+        <w:t>________________________________________________________________________</w:t>
+      </w:r>
+    </w:p>
+    <w:p>
+      <w:r>
+        <w:rPr>
+          <w:b w:val="0"/>
+          <w:sz w:val="24"/>
+        </w:rPr>
+        <w:t>________________________________________________________________________</w:t>
+      </w:r>
+    </w:p>
+    <w:p/>
+    <w:p>
+      <w:r>
+        <w:rPr>
+          <w:b w:val="0"/>
+          <w:sz w:val="24"/>
+        </w:rPr>
+        <w:t>6. Почему systemctl status не заменяет проверку /health.json?</w:t>
+      </w:r>
+    </w:p>
+    <w:p>
+      <w:r>
+        <w:rPr>
+          <w:b w:val="0"/>
+          <w:sz w:val="24"/>
+        </w:rPr>
+        <w:t>________________________________________________________________________</w:t>
+      </w:r>
+    </w:p>
+    <w:p>
+      <w:r>
+        <w:rPr>
+          <w:b w:val="0"/>
+          <w:sz w:val="24"/>
+        </w:rPr>
+        <w:t>________________________________________________________________________</w:t>
+      </w:r>
+    </w:p>
+    <w:p>
+      <w:r>
+        <w:rPr>
+          <w:b w:val="0"/>
+          <w:sz w:val="24"/>
+        </w:rPr>
+        <w:t>________________________________________________________________________</w:t>
+      </w:r>
+    </w:p>
+    <w:p/>
+    <w:p>
+      <w:r>
+        <w:rPr>
+          <w:b w:val="0"/>
+          <w:sz w:val="24"/>
+        </w:rPr>
+        <w:t>7. Чем проброс порта в VirtualBox удобнее изменения настроек хоста?</w:t>
+      </w:r>
+    </w:p>
+    <w:p>
+      <w:r>
+        <w:rPr>
+          <w:b w:val="0"/>
+          <w:sz w:val="24"/>
+        </w:rPr>
+        <w:t>________________________________________________________________________</w:t>
+      </w:r>
+    </w:p>
+    <w:p>
+      <w:r>
+        <w:rPr>
+          <w:b w:val="0"/>
+          <w:sz w:val="24"/>
+        </w:rPr>
+        <w:t>________________________________________________________________________</w:t>
+      </w:r>
+    </w:p>
+    <w:p>
+      <w:r>
+        <w:rPr>
+          <w:b w:val="0"/>
+          <w:sz w:val="24"/>
+        </w:rPr>
+        <w:t>________________________________________________________________________</w:t>
+      </w:r>
+    </w:p>
+    <w:p/>
     <w:sectPr>
       <w:pgSz w:w="12240" w:h="15840"/>
       <w:pgMar w:top="1440" w:right="1800" w:bottom="1440" w:left="1800" w:header="720" w:footer="720" w:gutter="0"/>
@@ -1009,6 +3195,10 @@
     <w:name w:val="Normal"/>
     <w:qFormat/>
     <w:rsid w:val="00FC693F"/>
+    <w:rPr>
+      <w:rFonts w:ascii="Times New Roman" w:hAnsi="Times New Roman"/>
+      <w:sz w:val="24"/>
+    </w:rPr>
   </w:style>
   <w:style w:type="paragraph" w:styleId="Header">
     <w:name w:val="header"/>

</xml_diff>